<commit_message>
docs(root): alinea las guias con v3.22 y corrige la regla de escalacion de devoluciones con y sin token
</commit_message>
<xml_diff>
--- a/docs/Investigacion Pre-proyecto/Cuadro comparativo - Harness empresarial.docx
+++ b/docs/Investigacion Pre-proyecto/Cuadro comparativo - Harness empresarial.docx
@@ -6045,7 +6045,7 @@
                 <w:sz w:val="22"/>
                 <w:szCs w:val="22"/>
               </w:rPr>
-              <w:t xml:space="preserve">4,0</w:t>
+              <w:t xml:space="preserve">3,5</w:t>
             </w:r>
             <w:r>
               <w:rPr>
@@ -6327,7 +6327,7 @@
           <w:sz w:val="21"/>
           <w:szCs w:val="21"/>
         </w:rPr>
-        <w:t xml:space="preserve">Claude Code (4,0). </w:t>
+        <w:t xml:space="preserve">Claude Code (3,5). </w:t>
       </w:r>
       <w:r>
         <w:rPr>

</xml_diff>